<commit_message>
till here word file is coming editable
</commit_message>
<xml_diff>
--- a/output/TestReport_DULAL NAHA (KOL2604070057)_2600128556_11d3f985-7e08-40be-91b4-48b35be363ee_report.docx
+++ b/output/TestReport_DULAL NAHA (KOL2604070057)_2600128556_11d3f985-7e08-40be-91b4-48b35be363ee_report.docx
@@ -51,9 +51,9 @@
         <w:autoSpaceDN w:val="0"/>
         <w:autoSpaceDE w:val="0"/>
         <w:widowControl/>
-        <w:spacing w:line="240" w:lineRule="auto" w:before="2734" w:after="358"/>
-        <w:ind w:left="0" w:right="0" w:firstLine="0"/>
-        <w:jc w:val="center"/>
+        <w:spacing w:line="240" w:lineRule="auto" w:before="2794" w:after="298"/>
+        <w:ind w:left="0" w:right="7386" w:firstLine="0"/>
+        <w:jc w:val="right"/>
       </w:pPr>
       <w:r>
         <w:rPr>

</xml_diff>